<commit_message>
Thêm thư mục KienTrucMayTinh với submodule Assembly_TicTacToe
</commit_message>
<xml_diff>
--- a/0 PTIT/Mau_don_phuc_khao.docx
+++ b/0 PTIT/Mau_don_phuc_khao.docx
@@ -1,6 +1,6 @@
 
 <file path=word/document.xml><?xml version="1.0" encoding="utf-8"?>
-<w:document xmlns:wpc="http://schemas.microsoft.com/office/word/2010/wordprocessingCanvas" xmlns:cx="http://schemas.microsoft.com/office/drawing/2014/chartex" xmlns:cx1="http://schemas.microsoft.com/office/drawing/2015/9/8/chartex" xmlns:cx2="http://schemas.microsoft.com/office/drawing/2015/10/21/chartex" xmlns:cx3="http://schemas.microsoft.com/office/drawing/2016/5/9/chartex" xmlns:cx4="http://schemas.microsoft.com/office/drawing/2016/5/10/chartex" xmlns:cx5="http://schemas.microsoft.com/office/drawing/2016/5/11/chartex" xmlns:cx6="http://schemas.microsoft.com/office/drawing/2016/5/12/chartex" xmlns:cx7="http://schemas.microsoft.com/office/drawing/2016/5/13/chartex" xmlns:cx8="http://schemas.microsoft.com/office/drawing/2016/5/14/chartex" xmlns:mc="http://schemas.openxmlformats.org/markup-compatibility/2006" xmlns:aink="http://schemas.microsoft.com/office/drawing/2016/ink" xmlns:am3d="http://schemas.microsoft.com/office/drawing/2017/model3d" xmlns:o="urn:schemas-microsoft-com:office:office" xmlns:oel="http://schemas.microsoft.com/office/2019/extlst" xmlns:r="http://schemas.openxmlformats.org/officeDocument/2006/relationships" xmlns:m="http://schemas.openxmlformats.org/officeDocument/2006/math" xmlns:v="urn:schemas-microsoft-com:vml" xmlns:wp14="http://schemas.microsoft.com/office/word/2010/wordprocessingDrawing" xmlns:wp="http://schemas.openxmlformats.org/drawingml/2006/wordprocessingDrawing" xmlns:w10="urn:schemas-microsoft-com:office:word" xmlns:w="http://schemas.openxmlformats.org/wordprocessingml/2006/main" xmlns:w14="http://schemas.microsoft.com/office/word/2010/wordml" xmlns:w15="http://schemas.microsoft.com/office/word/2012/wordml" xmlns:w16cex="http://schemas.microsoft.com/office/word/2018/wordml/cex" xmlns:w16cid="http://schemas.microsoft.com/office/word/2016/wordml/cid" xmlns:w16="http://schemas.microsoft.com/office/word/2018/wordml" xmlns:w16du="http://schemas.microsoft.com/office/word/2023/wordml/word16du" xmlns:w16sdtdh="http://schemas.microsoft.com/office/word/2020/wordml/sdtdatahash" xmlns:w16se="http://schemas.microsoft.com/office/word/2015/wordml/symex" xmlns:wpg="http://schemas.microsoft.com/office/word/2010/wordprocessingGroup" xmlns:wpi="http://schemas.microsoft.com/office/word/2010/wordprocessingInk" xmlns:wne="http://schemas.microsoft.com/office/word/2006/wordml" xmlns:wps="http://schemas.microsoft.com/office/word/2010/wordprocessingShape" mc:Ignorable="w14 w15 w16se w16cid w16 w16cex w16sdtdh w16du wp14">
+<w:document xmlns:wpc="http://schemas.microsoft.com/office/word/2010/wordprocessingCanvas" xmlns:cx="http://schemas.microsoft.com/office/drawing/2014/chartex" xmlns:cx1="http://schemas.microsoft.com/office/drawing/2015/9/8/chartex" xmlns:cx2="http://schemas.microsoft.com/office/drawing/2015/10/21/chartex" xmlns:cx3="http://schemas.microsoft.com/office/drawing/2016/5/9/chartex" xmlns:cx4="http://schemas.microsoft.com/office/drawing/2016/5/10/chartex" xmlns:cx5="http://schemas.microsoft.com/office/drawing/2016/5/11/chartex" xmlns:cx6="http://schemas.microsoft.com/office/drawing/2016/5/12/chartex" xmlns:cx7="http://schemas.microsoft.com/office/drawing/2016/5/13/chartex" xmlns:cx8="http://schemas.microsoft.com/office/drawing/2016/5/14/chartex" xmlns:mc="http://schemas.openxmlformats.org/markup-compatibility/2006" xmlns:aink="http://schemas.microsoft.com/office/drawing/2016/ink" xmlns:am3d="http://schemas.microsoft.com/office/drawing/2017/model3d" xmlns:o="urn:schemas-microsoft-com:office:office" xmlns:oel="http://schemas.microsoft.com/office/2019/extlst" xmlns:r="http://schemas.openxmlformats.org/officeDocument/2006/relationships" xmlns:m="http://schemas.openxmlformats.org/officeDocument/2006/math" xmlns:v="urn:schemas-microsoft-com:vml" xmlns:wp14="http://schemas.microsoft.com/office/word/2010/wordprocessingDrawing" xmlns:wp="http://schemas.openxmlformats.org/drawingml/2006/wordprocessingDrawing" xmlns:w10="urn:schemas-microsoft-com:office:word" xmlns:w="http://schemas.openxmlformats.org/wordprocessingml/2006/main" xmlns:w14="http://schemas.microsoft.com/office/word/2010/wordml" xmlns:w15="http://schemas.microsoft.com/office/word/2012/wordml" xmlns:w16cex="http://schemas.microsoft.com/office/word/2018/wordml/cex" xmlns:w16cid="http://schemas.microsoft.com/office/word/2016/wordml/cid" xmlns:w16="http://schemas.microsoft.com/office/word/2018/wordml" xmlns:w16du="http://schemas.microsoft.com/office/word/2023/wordml/word16du" xmlns:w16sdtdh="http://schemas.microsoft.com/office/word/2020/wordml/sdtdatahash" xmlns:w16sdtfl="http://schemas.microsoft.com/office/word/2024/wordml/sdtformatlock" xmlns:w16se="http://schemas.microsoft.com/office/word/2015/wordml/symex" xmlns:wpg="http://schemas.microsoft.com/office/word/2010/wordprocessingGroup" xmlns:wpi="http://schemas.microsoft.com/office/word/2010/wordprocessingInk" xmlns:wne="http://schemas.microsoft.com/office/word/2006/wordml" xmlns:wps="http://schemas.microsoft.com/office/word/2010/wordprocessingShape" mc:Ignorable="w14 w15 w16se w16cid w16 w16cex w16sdtdh w16sdtfl w16du wp14">
   <w:body>
     <w:p>
       <w:pPr>
@@ -438,7 +438,15 @@
           <w:sz w:val="24"/>
           <w:szCs w:val="24"/>
         </w:rPr>
-        <w:t xml:space="preserve"> Nhóm 12</w:t>
+        <w:t xml:space="preserve"> Nhóm </w:t>
+      </w:r>
+      <w:r>
+        <w:rPr>
+          <w:rFonts w:ascii="Times New Roman" w:eastAsia="Times New Roman" w:hAnsi="Times New Roman"/>
+          <w:sz w:val="24"/>
+          <w:szCs w:val="24"/>
+        </w:rPr>
+        <w:t>09</w:t>
       </w:r>
       <w:r>
         <w:rPr>
@@ -544,6 +552,7 @@
         </w:rPr>
         <w:t xml:space="preserve"> môn </w:t>
       </w:r>
+      <w:bookmarkStart w:id="0" w:name="_Hlk203241555"/>
       <w:r>
         <w:rPr>
           <w:rFonts w:ascii="Times New Roman" w:eastAsia="Times New Roman" w:hAnsi="Times New Roman"/>
@@ -551,8 +560,9 @@
           <w:sz w:val="24"/>
           <w:szCs w:val="24"/>
         </w:rPr>
-        <w:t>Vật lý ứng dụng</w:t>
-      </w:r>
+        <w:t>Kiến trúc máy tính</w:t>
+      </w:r>
+      <w:bookmarkEnd w:id="0"/>
     </w:p>
     <w:p>
       <w:pPr>
@@ -634,7 +644,7 @@
           <w:sz w:val="24"/>
           <w:szCs w:val="24"/>
         </w:rPr>
-        <w:t>2023</w:t>
+        <w:t>202</w:t>
       </w:r>
       <w:r>
         <w:rPr>
@@ -643,7 +653,25 @@
           <w:sz w:val="24"/>
           <w:szCs w:val="24"/>
         </w:rPr>
-        <w:t>-2024</w:t>
+        <w:t>4</w:t>
+      </w:r>
+      <w:r>
+        <w:rPr>
+          <w:rFonts w:ascii="Times New Roman" w:eastAsia="Times New Roman" w:hAnsi="Times New Roman"/>
+          <w:spacing w:val="-2"/>
+          <w:sz w:val="24"/>
+          <w:szCs w:val="24"/>
+        </w:rPr>
+        <w:t>-202</w:t>
+      </w:r>
+      <w:r>
+        <w:rPr>
+          <w:rFonts w:ascii="Times New Roman" w:eastAsia="Times New Roman" w:hAnsi="Times New Roman"/>
+          <w:spacing w:val="-2"/>
+          <w:sz w:val="24"/>
+          <w:szCs w:val="24"/>
+        </w:rPr>
+        <w:t>5</w:t>
       </w:r>
       <w:r>
         <w:rPr>
@@ -671,7 +699,7 @@
           <w:sz w:val="24"/>
           <w:szCs w:val="24"/>
         </w:rPr>
-        <w:t xml:space="preserve"> môn Vật lý ứng dụng</w:t>
+        <w:t xml:space="preserve"> môn </w:t>
       </w:r>
       <w:r>
         <w:rPr>
@@ -680,6 +708,15 @@
           <w:sz w:val="24"/>
           <w:szCs w:val="24"/>
         </w:rPr>
+        <w:t>Kiến trúc máy tính</w:t>
+      </w:r>
+      <w:r>
+        <w:rPr>
+          <w:rFonts w:ascii="Times New Roman" w:eastAsia="Times New Roman" w:hAnsi="Times New Roman"/>
+          <w:spacing w:val="-2"/>
+          <w:sz w:val="24"/>
+          <w:szCs w:val="24"/>
+        </w:rPr>
         <w:t xml:space="preserve"> (</w:t>
       </w:r>
       <w:r>
@@ -689,7 +726,7 @@
           <w:sz w:val="24"/>
           <w:szCs w:val="24"/>
         </w:rPr>
-        <w:t>BAS1270</w:t>
+        <w:t>INT13145</w:t>
       </w:r>
       <w:r>
         <w:rPr>
@@ -1060,7 +1097,7 @@
                 <w:sz w:val="24"/>
                 <w:szCs w:val="24"/>
               </w:rPr>
-              <w:t>Vật lý ứng dụng</w:t>
+              <w:t>Kiến trúc máy tính</w:t>
             </w:r>
           </w:p>
         </w:tc>
@@ -1087,7 +1124,7 @@
                 <w:sz w:val="24"/>
                 <w:szCs w:val="24"/>
               </w:rPr>
-              <w:t>03/07/2024</w:t>
+              <w:t>16/06/2025</w:t>
             </w:r>
           </w:p>
         </w:tc>
@@ -1114,7 +1151,7 @@
                 <w:sz w:val="24"/>
                 <w:szCs w:val="24"/>
               </w:rPr>
-              <w:t>6</w:t>
+              <w:t>7</w:t>
             </w:r>
           </w:p>
         </w:tc>
@@ -1141,7 +1178,7 @@
                 <w:sz w:val="24"/>
                 <w:szCs w:val="24"/>
               </w:rPr>
-              <w:t>Sáu</w:t>
+              <w:t>Bảy</w:t>
             </w:r>
           </w:p>
         </w:tc>
@@ -1298,7 +1335,7 @@
           <w:sz w:val="24"/>
           <w:szCs w:val="24"/>
         </w:rPr>
-        <w:t>28</w:t>
+        <w:t>12</w:t>
       </w:r>
       <w:r>
         <w:rPr>
@@ -1348,7 +1385,17 @@
           <w:sz w:val="24"/>
           <w:szCs w:val="24"/>
         </w:rPr>
-        <w:t>24</w:t>
+        <w:t>2</w:t>
+      </w:r>
+      <w:r>
+        <w:rPr>
+          <w:rFonts w:ascii="Times New Roman" w:eastAsia="Times New Roman" w:hAnsi="Times New Roman"/>
+          <w:i/>
+          <w:iCs/>
+          <w:sz w:val="24"/>
+          <w:szCs w:val="24"/>
+        </w:rPr>
+        <w:t>5</w:t>
       </w:r>
     </w:p>
     <w:p>
@@ -1519,7 +1566,7 @@
 </file>
 
 <file path=word/styles.xml><?xml version="1.0" encoding="utf-8"?>
-<w:styles xmlns:mc="http://schemas.openxmlformats.org/markup-compatibility/2006" xmlns:r="http://schemas.openxmlformats.org/officeDocument/2006/relationships" xmlns:w="http://schemas.openxmlformats.org/wordprocessingml/2006/main" xmlns:w14="http://schemas.microsoft.com/office/word/2010/wordml" xmlns:w15="http://schemas.microsoft.com/office/word/2012/wordml" xmlns:w16cex="http://schemas.microsoft.com/office/word/2018/wordml/cex" xmlns:w16cid="http://schemas.microsoft.com/office/word/2016/wordml/cid" xmlns:w16="http://schemas.microsoft.com/office/word/2018/wordml" xmlns:w16du="http://schemas.microsoft.com/office/word/2023/wordml/word16du" xmlns:w16sdtdh="http://schemas.microsoft.com/office/word/2020/wordml/sdtdatahash" xmlns:w16se="http://schemas.microsoft.com/office/word/2015/wordml/symex" mc:Ignorable="w14 w15 w16se w16cid w16 w16cex w16sdtdh w16du">
+<w:styles xmlns:mc="http://schemas.openxmlformats.org/markup-compatibility/2006" xmlns:r="http://schemas.openxmlformats.org/officeDocument/2006/relationships" xmlns:w="http://schemas.openxmlformats.org/wordprocessingml/2006/main" xmlns:w14="http://schemas.microsoft.com/office/word/2010/wordml" xmlns:w15="http://schemas.microsoft.com/office/word/2012/wordml" xmlns:w16cex="http://schemas.microsoft.com/office/word/2018/wordml/cex" xmlns:w16cid="http://schemas.microsoft.com/office/word/2016/wordml/cid" xmlns:w16="http://schemas.microsoft.com/office/word/2018/wordml" xmlns:w16du="http://schemas.microsoft.com/office/word/2023/wordml/word16du" xmlns:w16sdtdh="http://schemas.microsoft.com/office/word/2020/wordml/sdtdatahash" xmlns:w16sdtfl="http://schemas.microsoft.com/office/word/2024/wordml/sdtformatlock" xmlns:w16se="http://schemas.microsoft.com/office/word/2015/wordml/symex" mc:Ignorable="w14 w15 w16se w16cid w16 w16cex w16sdtdh w16sdtfl w16du">
   <w:docDefaults>
     <w:rPrDefault>
       <w:rPr>
@@ -1922,7 +1969,6 @@
   <w:style w:type="character" w:default="1" w:styleId="DefaultParagraphFont">
     <w:name w:val="Default Paragraph Font"/>
     <w:uiPriority w:val="1"/>
-    <w:semiHidden/>
     <w:unhideWhenUsed/>
   </w:style>
   <w:style w:type="table" w:default="1" w:styleId="TableNormal">

</xml_diff>